<commit_message>
Restore earlier aerospace project history
</commit_message>
<xml_diff>
--- a/Triasha_Sarkar_CV.docx
+++ b/Triasha_Sarkar_CV.docx
@@ -293,6 +293,58 @@
     </w:p>
     <w:p>
       <w:pPr>
+        <w:pStyle w:val="BodyText"/>
+        <w:bidi w:val="0"/>
+        <w:spacing w:before="30" w:after="60"/>
+        <w:ind w:start="30" w:end="30"/>
+        <w:rPr/>
+      </w:pPr>
+      <w:r>
+        <w:rPr/>
+        <w:t>Project EAGLE — Vehicle Grand Challenge, Georgia Tech2025 – 2026</w:t>
+      </w:r>
+    </w:p>
+    <w:p>
+      <w:pPr>
+        <w:pStyle w:val="BodyText"/>
+        <w:bidi w:val="0"/>
+        <w:spacing w:before="30" w:after="60"/>
+        <w:ind w:start="30" w:end="30"/>
+        <w:rPr/>
+      </w:pPr>
+      <w:r>
+        <w:rPr/>
+        <w:t>Developed a vehicle sizing and synthesis tool for an eco-friendly airborne vehicle, including requirements, cabin geometry, passenger layout, and system-level trade studies.</w:t>
+      </w:r>
+    </w:p>
+    <w:p>
+      <w:pPr>
+        <w:pStyle w:val="BodyText"/>
+        <w:bidi w:val="0"/>
+        <w:spacing w:before="30" w:after="60"/>
+        <w:ind w:start="30" w:end="30"/>
+        <w:rPr/>
+      </w:pPr>
+      <w:r>
+        <w:rPr/>
+        <w:t>Project GREEN TEA — System of Systems Grand Challenge, Georgia Tech2025 – 2026</w:t>
+      </w:r>
+    </w:p>
+    <w:p>
+      <w:pPr>
+        <w:pStyle w:val="BodyText"/>
+        <w:bidi w:val="0"/>
+        <w:spacing w:before="30" w:after="60"/>
+        <w:ind w:start="30" w:end="30"/>
+        <w:rPr/>
+      </w:pPr>
+      <w:r>
+        <w:rPr/>
+        <w:t>Developed a techno-economic and impact-analysis framework for forest-residue bioenergy and sustainable aviation fuel, including jobs, emissions, and forest-health modeling.</w:t>
+      </w:r>
+    </w:p>
+    <w:p>
+      <w:pPr>
         <w:pStyle w:val="Heading2"/>
         <w:numPr>
           <w:ilvl w:val="0"/>
@@ -713,6 +765,158 @@
       <w:r>
         <w:rPr/>
         <w:t>Reliable ML systems with explicit data, deployment, and evidence boundaries.</w:t>
+      </w:r>
+    </w:p>
+    <w:p>
+      <w:pPr>
+        <w:pStyle w:val="Heading2"/>
+        <w:numPr>
+          <w:ilvl w:val="0"/>
+          <w:numId w:val="0"/>
+        </w:numPr>
+        <w:pBdr/>
+        <w:bidi w:val="0"/>
+        <w:spacing w:before="150" w:after="60"/>
+        <w:ind w:start="150" w:end="150"/>
+        <w:rPr/>
+      </w:pPr>
+      <w:r>
+        <w:rPr/>
+        <w:t>Earlier aerospace projects</w:t>
+      </w:r>
+    </w:p>
+    <w:p>
+      <w:pPr>
+        <w:pStyle w:val="BodyText"/>
+        <w:numPr>
+          <w:ilvl w:val="0"/>
+          <w:numId w:val="5"/>
+        </w:numPr>
+        <w:tabs>
+          <w:tab w:val="clear" w:pos="1134"/>
+          <w:tab w:val="left" w:pos="739" w:leader="none"/>
+        </w:tabs>
+        <w:bidi w:val="0"/>
+        <w:spacing w:before="30" w:after="0"/>
+        <w:ind w:hanging="283" w:start="739"/>
+        <w:rPr/>
+      </w:pPr>
+      <w:r>
+        <w:rPr>
+          <w:b/>
+        </w:rPr>
+        <w:t>GKN Aerospace hybrid aircraft design:</w:t>
+      </w:r>
+      <w:r>
+        <w:rPr/>
+        <w:t xml:space="preserve"> thermal-management integration for a zero-emission demonstrator using hybrid, electric, and hydrogen system concepts.</w:t>
+      </w:r>
+    </w:p>
+    <w:p>
+      <w:pPr>
+        <w:pStyle w:val="BodyText"/>
+        <w:numPr>
+          <w:ilvl w:val="0"/>
+          <w:numId w:val="5"/>
+        </w:numPr>
+        <w:tabs>
+          <w:tab w:val="clear" w:pos="1134"/>
+          <w:tab w:val="left" w:pos="739" w:leader="none"/>
+        </w:tabs>
+        <w:bidi w:val="0"/>
+        <w:spacing w:before="30" w:after="0"/>
+        <w:ind w:hanging="283" w:start="739"/>
+        <w:rPr/>
+      </w:pPr>
+      <w:r>
+        <w:rPr>
+          <w:b/>
+        </w:rPr>
+        <w:t>Supersonic business-jet thesis:</w:t>
+      </w:r>
+      <w:r>
+        <w:rPr/>
+        <w:t xml:space="preserve"> studied primary-nozzle geometry and noise-mitigation constraints for take-off and landing.</w:t>
+      </w:r>
+    </w:p>
+    <w:p>
+      <w:pPr>
+        <w:pStyle w:val="BodyText"/>
+        <w:numPr>
+          <w:ilvl w:val="0"/>
+          <w:numId w:val="5"/>
+        </w:numPr>
+        <w:tabs>
+          <w:tab w:val="clear" w:pos="1134"/>
+          <w:tab w:val="left" w:pos="739" w:leader="none"/>
+        </w:tabs>
+        <w:bidi w:val="0"/>
+        <w:spacing w:before="30" w:after="0"/>
+        <w:ind w:hanging="283" w:start="739"/>
+        <w:rPr/>
+      </w:pPr>
+      <w:r>
+        <w:rPr>
+          <w:b/>
+        </w:rPr>
+        <w:t>Bird-strike structural analysis:</w:t>
+      </w:r>
+      <w:r>
+        <w:rPr/>
+        <w:t xml:space="preserve"> used ANSYS to compare nose-cone material response under impact loading.</w:t>
+      </w:r>
+    </w:p>
+    <w:p>
+      <w:pPr>
+        <w:pStyle w:val="BodyText"/>
+        <w:numPr>
+          <w:ilvl w:val="0"/>
+          <w:numId w:val="5"/>
+        </w:numPr>
+        <w:tabs>
+          <w:tab w:val="clear" w:pos="1134"/>
+          <w:tab w:val="left" w:pos="739" w:leader="none"/>
+        </w:tabs>
+        <w:bidi w:val="0"/>
+        <w:spacing w:before="30" w:after="0"/>
+        <w:ind w:hanging="283" w:start="739"/>
+        <w:rPr/>
+      </w:pPr>
+      <w:r>
+        <w:rPr>
+          <w:b/>
+        </w:rPr>
+        <w:t>Rocket test-pad internship, STAR:</w:t>
+      </w:r>
+      <w:r>
+        <w:rPr/>
+        <w:t xml:space="preserve"> contributed to static-test-pad mechanical design and Arduino-based avionics and safety systems.</w:t>
+      </w:r>
+    </w:p>
+    <w:p>
+      <w:pPr>
+        <w:pStyle w:val="BodyText"/>
+        <w:numPr>
+          <w:ilvl w:val="0"/>
+          <w:numId w:val="5"/>
+        </w:numPr>
+        <w:tabs>
+          <w:tab w:val="clear" w:pos="1134"/>
+          <w:tab w:val="left" w:pos="739" w:leader="none"/>
+        </w:tabs>
+        <w:bidi w:val="0"/>
+        <w:ind w:hanging="283" w:start="739"/>
+        <w:rPr/>
+      </w:pPr>
+      <w:r>
+        <w:rPr>
+          <w:b/>
+        </w:rPr>
+        <w:t>Aircraft structures internship, BAIL:</w:t>
+      </w:r>
+      <w:r>
+        <w:rPr/>
+        <w:t xml:space="preserve"> analyzed stress and material behavior under environmental loading and supported experimental test setups.</w:t>
       </w:r>
     </w:p>
     <w:p>
@@ -1314,6 +1518,143 @@
       </w:rPr>
     </w:lvl>
   </w:abstractNum>
+  <w:abstractNum w:abstractNumId="5">
+    <w:lvl w:ilvl="0">
+      <w:start w:val="1"/>
+      <w:numFmt w:val="bullet"/>
+      <w:lvlText w:val=""/>
+      <w:lvlJc w:val="start"/>
+      <w:pPr>
+        <w:tabs>
+          <w:tab w:val="num" w:pos="709"/>
+        </w:tabs>
+        <w:ind w:start="709" w:hanging="283"/>
+      </w:pPr>
+      <w:rPr>
+        <w:rFonts w:ascii="Symbol" w:hAnsi="Symbol" w:cs="Symbol" w:hint="default"/>
+      </w:rPr>
+    </w:lvl>
+    <w:lvl w:ilvl="1">
+      <w:start w:val="1"/>
+      <w:numFmt w:val="bullet"/>
+      <w:lvlText w:val=""/>
+      <w:lvlJc w:val="start"/>
+      <w:pPr>
+        <w:tabs>
+          <w:tab w:val="num" w:pos="1418"/>
+        </w:tabs>
+        <w:ind w:start="1418" w:hanging="283"/>
+      </w:pPr>
+      <w:rPr>
+        <w:rFonts w:ascii="Symbol" w:hAnsi="Symbol" w:cs="Symbol" w:hint="default"/>
+      </w:rPr>
+    </w:lvl>
+    <w:lvl w:ilvl="2">
+      <w:start w:val="1"/>
+      <w:numFmt w:val="bullet"/>
+      <w:lvlText w:val=""/>
+      <w:lvlJc w:val="start"/>
+      <w:pPr>
+        <w:tabs>
+          <w:tab w:val="num" w:pos="2127"/>
+        </w:tabs>
+        <w:ind w:start="2127" w:hanging="283"/>
+      </w:pPr>
+      <w:rPr>
+        <w:rFonts w:ascii="Symbol" w:hAnsi="Symbol" w:cs="Symbol" w:hint="default"/>
+      </w:rPr>
+    </w:lvl>
+    <w:lvl w:ilvl="3">
+      <w:start w:val="1"/>
+      <w:numFmt w:val="bullet"/>
+      <w:lvlText w:val=""/>
+      <w:lvlJc w:val="start"/>
+      <w:pPr>
+        <w:tabs>
+          <w:tab w:val="num" w:pos="2836"/>
+        </w:tabs>
+        <w:ind w:start="2836" w:hanging="283"/>
+      </w:pPr>
+      <w:rPr>
+        <w:rFonts w:ascii="Symbol" w:hAnsi="Symbol" w:cs="Symbol" w:hint="default"/>
+      </w:rPr>
+    </w:lvl>
+    <w:lvl w:ilvl="4">
+      <w:start w:val="1"/>
+      <w:numFmt w:val="bullet"/>
+      <w:lvlText w:val=""/>
+      <w:lvlJc w:val="start"/>
+      <w:pPr>
+        <w:tabs>
+          <w:tab w:val="num" w:pos="3545"/>
+        </w:tabs>
+        <w:ind w:start="3545" w:hanging="283"/>
+      </w:pPr>
+      <w:rPr>
+        <w:rFonts w:ascii="Symbol" w:hAnsi="Symbol" w:cs="Symbol" w:hint="default"/>
+      </w:rPr>
+    </w:lvl>
+    <w:lvl w:ilvl="5">
+      <w:start w:val="1"/>
+      <w:numFmt w:val="bullet"/>
+      <w:lvlText w:val=""/>
+      <w:lvlJc w:val="start"/>
+      <w:pPr>
+        <w:tabs>
+          <w:tab w:val="num" w:pos="4254"/>
+        </w:tabs>
+        <w:ind w:start="4254" w:hanging="283"/>
+      </w:pPr>
+      <w:rPr>
+        <w:rFonts w:ascii="Symbol" w:hAnsi="Symbol" w:cs="Symbol" w:hint="default"/>
+      </w:rPr>
+    </w:lvl>
+    <w:lvl w:ilvl="6">
+      <w:start w:val="1"/>
+      <w:numFmt w:val="bullet"/>
+      <w:lvlText w:val=""/>
+      <w:lvlJc w:val="start"/>
+      <w:pPr>
+        <w:tabs>
+          <w:tab w:val="num" w:pos="4963"/>
+        </w:tabs>
+        <w:ind w:start="4963" w:hanging="283"/>
+      </w:pPr>
+      <w:rPr>
+        <w:rFonts w:ascii="Symbol" w:hAnsi="Symbol" w:cs="Symbol" w:hint="default"/>
+      </w:rPr>
+    </w:lvl>
+    <w:lvl w:ilvl="7">
+      <w:start w:val="1"/>
+      <w:numFmt w:val="bullet"/>
+      <w:lvlText w:val=""/>
+      <w:lvlJc w:val="start"/>
+      <w:pPr>
+        <w:tabs>
+          <w:tab w:val="num" w:pos="5672"/>
+        </w:tabs>
+        <w:ind w:start="5672" w:hanging="283"/>
+      </w:pPr>
+      <w:rPr>
+        <w:rFonts w:ascii="Symbol" w:hAnsi="Symbol" w:cs="Symbol" w:hint="default"/>
+      </w:rPr>
+    </w:lvl>
+    <w:lvl w:ilvl="8">
+      <w:start w:val="1"/>
+      <w:numFmt w:val="bullet"/>
+      <w:lvlText w:val=""/>
+      <w:lvlJc w:val="start"/>
+      <w:pPr>
+        <w:tabs>
+          <w:tab w:val="num" w:pos="6381"/>
+        </w:tabs>
+        <w:ind w:start="6381" w:hanging="283"/>
+      </w:pPr>
+      <w:rPr>
+        <w:rFonts w:ascii="Symbol" w:hAnsi="Symbol" w:cs="Symbol" w:hint="default"/>
+      </w:rPr>
+    </w:lvl>
+  </w:abstractNum>
   <w:num w:numId="1">
     <w:abstractNumId w:val="1"/>
   </w:num>
@@ -1325,6 +1666,9 @@
   </w:num>
   <w:num w:numId="4">
     <w:abstractNumId w:val="4"/>
+  </w:num>
+  <w:num w:numId="5">
+    <w:abstractNumId w:val="5"/>
   </w:num>
 </w:numbering>
 </file>

</xml_diff>

<commit_message>
Group internships under experience and simplify title
</commit_message>
<xml_diff>
--- a/Triasha_Sarkar_CV.docx
+++ b/Triasha_Sarkar_CV.docx
@@ -130,7 +130,7 @@
       </w:pPr>
       <w:r>
         <w:rPr/>
-        <w:t>Systems Engineer — Alten India / Rolls-Royce engagementOct 2023 – Apr 2025</w:t>
+        <w:t>Engineer — Rolls-Royce engagement, Alten IndiaOct 2023 – Apr 2025</w:t>
       </w:r>
     </w:p>
     <w:p>
@@ -341,6 +341,58 @@
       <w:r>
         <w:rPr/>
         <w:t>Developed a techno-economic and impact-analysis framework for forest-residue bioenergy and sustainable aviation fuel, including jobs, emissions, and forest-health modeling.</w:t>
+      </w:r>
+    </w:p>
+    <w:p>
+      <w:pPr>
+        <w:pStyle w:val="BodyText"/>
+        <w:bidi w:val="0"/>
+        <w:spacing w:before="30" w:after="60"/>
+        <w:ind w:start="30" w:end="30"/>
+        <w:rPr/>
+      </w:pPr>
+      <w:r>
+        <w:rPr/>
+        <w:t>Summer Intern — Space Technology and Aeronautical Rocketry (STAR)Jun 2021 – Jul 2021</w:t>
+      </w:r>
+    </w:p>
+    <w:p>
+      <w:pPr>
+        <w:pStyle w:val="BodyText"/>
+        <w:bidi w:val="0"/>
+        <w:spacing w:before="30" w:after="60"/>
+        <w:ind w:start="30" w:end="30"/>
+        <w:rPr/>
+      </w:pPr>
+      <w:r>
+        <w:rPr/>
+        <w:t>Contributed to static-test-pad mechanical design and Arduino-based avionics and safety systems for solid-rocket testing.</w:t>
+      </w:r>
+    </w:p>
+    <w:p>
+      <w:pPr>
+        <w:pStyle w:val="BodyText"/>
+        <w:bidi w:val="0"/>
+        <w:spacing w:before="30" w:after="60"/>
+        <w:ind w:start="30" w:end="30"/>
+        <w:rPr/>
+      </w:pPr>
+      <w:r>
+        <w:rPr/>
+        <w:t>Summer Intern — Bangalore Aircraft Industries (BAIL)Jun 2019 – Jul 2019</w:t>
+      </w:r>
+    </w:p>
+    <w:p>
+      <w:pPr>
+        <w:pStyle w:val="BodyText"/>
+        <w:bidi w:val="0"/>
+        <w:spacing w:before="30" w:after="60"/>
+        <w:ind w:start="30" w:end="30"/>
+        <w:rPr/>
+      </w:pPr>
+      <w:r>
+        <w:rPr/>
+        <w:t>Analyzed stress and material behavior under environmental loading and supported experimental aircraft-structure test setups.</w:t>
       </w:r>
     </w:p>
     <w:p>
@@ -851,7 +903,6 @@
           <w:tab w:val="left" w:pos="739" w:leader="none"/>
         </w:tabs>
         <w:bidi w:val="0"/>
-        <w:spacing w:before="30" w:after="0"/>
         <w:ind w:hanging="283" w:start="739"/>
         <w:rPr/>
       </w:pPr>
@@ -864,59 +915,6 @@
       <w:r>
         <w:rPr/>
         <w:t xml:space="preserve"> used ANSYS to compare nose-cone material response under impact loading.</w:t>
-      </w:r>
-    </w:p>
-    <w:p>
-      <w:pPr>
-        <w:pStyle w:val="BodyText"/>
-        <w:numPr>
-          <w:ilvl w:val="0"/>
-          <w:numId w:val="5"/>
-        </w:numPr>
-        <w:tabs>
-          <w:tab w:val="clear" w:pos="1134"/>
-          <w:tab w:val="left" w:pos="739" w:leader="none"/>
-        </w:tabs>
-        <w:bidi w:val="0"/>
-        <w:spacing w:before="30" w:after="0"/>
-        <w:ind w:hanging="283" w:start="739"/>
-        <w:rPr/>
-      </w:pPr>
-      <w:r>
-        <w:rPr>
-          <w:b/>
-        </w:rPr>
-        <w:t>Rocket test-pad internship, STAR:</w:t>
-      </w:r>
-      <w:r>
-        <w:rPr/>
-        <w:t xml:space="preserve"> contributed to static-test-pad mechanical design and Arduino-based avionics and safety systems.</w:t>
-      </w:r>
-    </w:p>
-    <w:p>
-      <w:pPr>
-        <w:pStyle w:val="BodyText"/>
-        <w:numPr>
-          <w:ilvl w:val="0"/>
-          <w:numId w:val="5"/>
-        </w:numPr>
-        <w:tabs>
-          <w:tab w:val="clear" w:pos="1134"/>
-          <w:tab w:val="left" w:pos="739" w:leader="none"/>
-        </w:tabs>
-        <w:bidi w:val="0"/>
-        <w:ind w:hanging="283" w:start="739"/>
-        <w:rPr/>
-      </w:pPr>
-      <w:r>
-        <w:rPr>
-          <w:b/>
-        </w:rPr>
-        <w:t>Aircraft structures internship, BAIL:</w:t>
-      </w:r>
-      <w:r>
-        <w:rPr/>
-        <w:t xml:space="preserve"> analyzed stress and material behavior under environmental loading and supported experimental test setups.</w:t>
       </w:r>
     </w:p>
     <w:p>

</xml_diff>

<commit_message>
Restore exact EAGLE and GREEN TEA descriptions
</commit_message>
<xml_diff>
--- a/Triasha_Sarkar_CV.docx
+++ b/Triasha_Sarkar_CV.docx
@@ -301,20 +301,20 @@
       </w:pPr>
       <w:r>
         <w:rPr/>
-        <w:t>Project EAGLE — Vehicle Grand Challenge, Georgia Tech2025 – 2026</w:t>
-      </w:r>
-    </w:p>
-    <w:p>
-      <w:pPr>
-        <w:pStyle w:val="BodyText"/>
-        <w:bidi w:val="0"/>
-        <w:spacing w:before="30" w:after="60"/>
-        <w:ind w:start="30" w:end="30"/>
-        <w:rPr/>
-      </w:pPr>
-      <w:r>
-        <w:rPr/>
-        <w:t>Developed a vehicle sizing and synthesis tool for an eco-friendly airborne vehicle, including requirements, cabin geometry, passenger layout, and system-level trade studies.</w:t>
+        <w:t>Project EAGLE — Vehicle Grand Challenge with RIC Enterprise, Georgia Tech2025 – 2026</w:t>
+      </w:r>
+    </w:p>
+    <w:p>
+      <w:pPr>
+        <w:pStyle w:val="BodyText"/>
+        <w:bidi w:val="0"/>
+        <w:spacing w:before="30" w:after="60"/>
+        <w:ind w:start="30" w:end="30"/>
+        <w:rPr/>
+      </w:pPr>
+      <w:r>
+        <w:rPr/>
+        <w:t>Worked on Project EAGLE (Eco-friendly Airborne Global Luxury Ekranoplan), a two-semester industry-sponsored research project. Developed a sizing and synthesis tool for a one-of-a-kind vehicle, and developed the passenger-accommodation layout and cabin geometry in AutoCAD while modifying and developing vehicle requirements.</w:t>
       </w:r>
     </w:p>
     <w:p>
@@ -340,7 +340,7 @@
       </w:pPr>
       <w:r>
         <w:rPr/>
-        <w:t>Developed a techno-economic and impact-analysis framework for forest-residue bioenergy and sustainable aviation fuel, including jobs, emissions, and forest-health modeling.</w:t>
+        <w:t>Worked on Project GREEN TEA (Generalized Residue to Energy Evaluation Network and Techno-Economic Analysis), an industry-sponsored project with the U.S. Endowment for Forestry and Communities. Developed the architecture and framework for a techno-economic tool analyzing sustainable aviation fuel and bioenergy from forest residues, including jobs, CO₂ impacts, a GREET life-cycle-analysis surrogate model, and a forest-health impact model.</w:t>
       </w:r>
     </w:p>
     <w:p>

</xml_diff>

<commit_message>
Align CV experience with LinkedIn
</commit_message>
<xml_diff>
--- a/Triasha_Sarkar_CV.docx
+++ b/Triasha_Sarkar_CV.docx
@@ -130,7 +130,7 @@
       </w:pPr>
       <w:r>
         <w:rPr/>
-        <w:t>Engineer — Rolls-Royce engagement, Alten IndiaOct 2023 – Apr 2025</w:t>
+        <w:t>Machine Learning Engineer — Rolls-RoyceJul 2023 – Apr 2025</w:t>
       </w:r>
     </w:p>
     <w:p>
@@ -151,7 +151,7 @@
       </w:pPr>
       <w:r>
         <w:rPr/>
-        <w:t>Worked on aircraft-engine systems development and certification activities for the Trent XWB-84 program.</w:t>
+        <w:t>Built machine-learning and predictive-maintenance workflows for aircraft-engine sensor data.</w:t>
       </w:r>
     </w:p>
     <w:p>
@@ -172,7 +172,7 @@
       </w:pPr>
       <w:r>
         <w:rPr/>
-        <w:t>Collected, analyzed, and managed customer and system requirements using IBM DOORS.</w:t>
+        <w:t>Developed Python pipelines for 1 Hz and 10 Hz multivariate time-series data, including cleaning, feature engineering, anomaly detection, and model evaluation.</w:t>
       </w:r>
     </w:p>
     <w:p>
@@ -193,7 +193,7 @@
       </w:pPr>
       <w:r>
         <w:rPr/>
-        <w:t>Supported system architecture, verification and validation, integration, risk tracking, and compliance documentation.</w:t>
+        <w:t>Worked with Lifecycle Engineers and domain experts to understand failure modes and turn model outputs into maintenance insights.</w:t>
       </w:r>
     </w:p>
     <w:p>
@@ -213,20 +213,20 @@
       </w:pPr>
       <w:r>
         <w:rPr/>
-        <w:t>Worked with engineering, customer, and program stakeholders to keep requirements and evidence aligned.</w:t>
-      </w:r>
-    </w:p>
-    <w:p>
-      <w:pPr>
-        <w:pStyle w:val="BodyText"/>
-        <w:bidi w:val="0"/>
-        <w:spacing w:before="30" w:after="60"/>
-        <w:ind w:start="30" w:end="30"/>
-        <w:rPr/>
-      </w:pPr>
-      <w:r>
-        <w:rPr/>
-        <w:t>Graduate Researcher — Georgia Tech Aerospace Systems Design Laboratory2025 – 2026</w:t>
+        <w:t>Used Azure Databricks for repeatable analysis of large engineering datasets and contributed to solutions supporting earlier issue detection.</w:t>
+      </w:r>
+    </w:p>
+    <w:p>
+      <w:pPr>
+        <w:pStyle w:val="BodyText"/>
+        <w:bidi w:val="0"/>
+        <w:spacing w:before="30" w:after="60"/>
+        <w:ind w:start="30" w:end="30"/>
+        <w:rPr/>
+      </w:pPr>
+      <w:r>
+        <w:rPr/>
+        <w:t>Graduate Research Assistant — Aerospace Systems Design Laboratory, Georgia TechMay 2025 – Aug 2026</w:t>
       </w:r>
     </w:p>
     <w:p>
@@ -247,7 +247,7 @@
       </w:pPr>
       <w:r>
         <w:rPr/>
-        <w:t>Worked on aviation systems, scientific ML, sustainable aviation, simulation reliability, and decision-support tools.</w:t>
+        <w:t>Built a failure-detection workflow using 15,120 simulated rocket-motor time-series cases, reaching 96.8% accuracy and 0.986 ROC AUC on unseen geometries.</w:t>
       </w:r>
     </w:p>
     <w:p>
@@ -268,7 +268,7 @@
       </w:pPr>
       <w:r>
         <w:rPr/>
-        <w:t>Built reproducible research software for retrieval, ranking, surrogate modeling, evaluation, and deployment studies.</w:t>
+        <w:t>Worked on the Delta Air Lines-sponsored HERO project, exploring retrieval and RAG methods for safety-related information.</w:t>
       </w:r>
     </w:p>
     <w:p>
@@ -283,12 +283,33 @@
           <w:tab w:val="left" w:pos="739" w:leader="none"/>
         </w:tabs>
         <w:bidi w:val="0"/>
+        <w:spacing w:before="30" w:after="0"/>
         <w:ind w:hanging="283" w:start="739"/>
         <w:rPr/>
       </w:pPr>
       <w:r>
         <w:rPr/>
-        <w:t>Translated model behavior and limitations into engineering-facing evidence and documentation.</w:t>
+        <w:t>Developed surrogate models for the GREEN TEA project, connecting lifecycle, economic, and transportation data for faster engineering analysis.</w:t>
+      </w:r>
+    </w:p>
+    <w:p>
+      <w:pPr>
+        <w:pStyle w:val="BodyText"/>
+        <w:numPr>
+          <w:ilvl w:val="0"/>
+          <w:numId w:val="3"/>
+        </w:numPr>
+        <w:tabs>
+          <w:tab w:val="clear" w:pos="1134"/>
+          <w:tab w:val="left" w:pos="739" w:leader="none"/>
+        </w:tabs>
+        <w:bidi w:val="0"/>
+        <w:ind w:hanging="283" w:start="739"/>
+        <w:rPr/>
+      </w:pPr>
+      <w:r>
+        <w:rPr/>
+        <w:t>Applied Python, scikit-learn, statistical modeling, feature engineering, clustering, and model evaluation with a focus on reproducibility and failure analysis.</w:t>
       </w:r>
     </w:p>
     <w:p>
@@ -353,20 +374,46 @@
       </w:pPr>
       <w:r>
         <w:rPr/>
-        <w:t>Summer Intern — Space Technology and Aeronautical Rocketry (STAR)Jun 2021 – Jul 2021</w:t>
-      </w:r>
-    </w:p>
-    <w:p>
-      <w:pPr>
-        <w:pStyle w:val="BodyText"/>
-        <w:bidi w:val="0"/>
-        <w:spacing w:before="30" w:after="60"/>
-        <w:ind w:start="30" w:end="30"/>
-        <w:rPr/>
-      </w:pPr>
-      <w:r>
-        <w:rPr/>
-        <w:t>Contributed to static-test-pad mechanical design and Arduino-based avionics and safety systems for solid-rocket testing.</w:t>
+        <w:t>Intern — STAR OrbitalsAug 2021 – Oct 2021</w:t>
+      </w:r>
+    </w:p>
+    <w:p>
+      <w:pPr>
+        <w:pStyle w:val="BodyText"/>
+        <w:bidi w:val="0"/>
+        <w:spacing w:before="30" w:after="60"/>
+        <w:ind w:start="30" w:end="30"/>
+        <w:rPr/>
+      </w:pPr>
+      <w:r>
+        <w:rPr/>
+        <w:t>Interned at STAR Orbitals from Aug 2021 to Oct 2021, contributing to static-test-pad development for solid rocket motors, client timelines, project planning, Arduino avionics, SolidWorks, and Autodesk Fusion 360 mechanical design.</w:t>
+      </w:r>
+    </w:p>
+    <w:p>
+      <w:pPr>
+        <w:pStyle w:val="BodyText"/>
+        <w:bidi w:val="0"/>
+        <w:spacing w:before="30" w:after="60"/>
+        <w:ind w:start="30" w:end="30"/>
+        <w:rPr/>
+      </w:pPr>
+      <w:r>
+        <w:rPr/>
+        <w:t>Intern — Rolls-Royce DataLabsMay 2021 – Jul 2021</w:t>
+      </w:r>
+    </w:p>
+    <w:p>
+      <w:pPr>
+        <w:pStyle w:val="BodyText"/>
+        <w:bidi w:val="0"/>
+        <w:spacing w:before="30" w:after="60"/>
+        <w:ind w:start="30" w:end="30"/>
+        <w:rPr/>
+      </w:pPr>
+      <w:r>
+        <w:rPr/>
+        <w:t>Worked on aerospace data projects involving predictive analytics, anomaly detection, model-based engineering, exploratory analysis, feature engineering, and time-series sensor data in a safety-critical environment.</w:t>
       </w:r>
     </w:p>
     <w:p>
@@ -392,7 +439,7 @@
       </w:pPr>
       <w:r>
         <w:rPr/>
-        <w:t>Analyzed stress and material behavior under environmental loading and supported experimental aircraft-structure test setups.</w:t>
+        <w:t>Worked on material testing, stress analysis, and structural testing using NASTRAN-PATRAN.</w:t>
       </w:r>
     </w:p>
     <w:p>

</xml_diff>

<commit_message>
Update CV project evidence
</commit_message>
<xml_diff>
--- a/Triasha_Sarkar_CV.docx
+++ b/Triasha_Sarkar_CV.docx
@@ -491,7 +491,7 @@
       </w:pPr>
       <w:r>
         <w:rPr/>
-        <w:t>Built evaluation contracts for retrieval, citation support, agent trajectories, safe degradation, observability, and held-out comparisons. Includes QASPER/SciFact evaluation paths and citation-corruption tests.</w:t>
+        <w:t>Built a provenance-aware RAG evaluation system with BM25, dense retrieval, hybrid reranking, citation checks, safe agent degradation, and held-out QASPER/SciFact evaluation. Measured retrieval behavior from 10K to 1M NASA-text snapshots rather than assuming scale preserved ranking quality.</w:t>
       </w:r>
     </w:p>
     <w:p>
@@ -525,7 +525,7 @@
       </w:pPr>
       <w:r>
         <w:rPr/>
-        <w:t>Built a containerized retrieval service with separate application and state hosts, Kafka, Postgres, health checks, evidence runners, and documented deployment boundaries.</w:t>
+        <w:t>Built a FastAPI news-retrieval service with Go ingestion, Kafka, PostgreSQL, Docker/Kubernetes deployment paths, and reproducible MIND evaluation. The selected content-plus-fallback model reached NDCG@10 0.3664; a weaker learned ranker was rejected under the frozen comparison.</w:t>
       </w:r>
     </w:p>
     <w:p>
@@ -559,20 +559,20 @@
       </w:pPr>
       <w:r>
         <w:rPr/>
-        <w:t>Built fail-closed release gates, public evidence receipts, CUDA transformer evaluation paths, and candidate assessment tooling without overstating missing human-review evidence.</w:t>
-      </w:r>
-    </w:p>
-    <w:p>
-      <w:pPr>
-        <w:pStyle w:val="BodyText"/>
-        <w:bidi w:val="0"/>
-        <w:spacing w:before="30" w:after="60"/>
-        <w:ind w:start="30" w:end="30"/>
-        <w:rPr/>
-      </w:pPr>
-      <w:r>
-        <w:rPr/>
-        <w:t>EdgeGenBench — Edge inference evidence</w:t>
+        <w:t>Built an integrity-evaluation and deployment workflow measuring macro F1, false acceptance, false rejection, calibration, policy citation accuracy, and latency. Added public evidence receipts, CUDA evaluation paths, release gates, monitoring hooks, and an AWS reference deployment plan.</w:t>
+      </w:r>
+    </w:p>
+    <w:p>
+      <w:pPr>
+        <w:pStyle w:val="BodyText"/>
+        <w:bidi w:val="0"/>
+        <w:spacing w:before="30" w:after="60"/>
+        <w:ind w:start="30" w:end="30"/>
+        <w:rPr/>
+      </w:pPr>
+      <w:r>
+        <w:rPr/>
+        <w:t>EdgeGenBench — Edge inference and flight-anomaly evaluation</w:t>
       </w:r>
       <w:hyperlink r:id="rId9">
         <w:r>
@@ -593,7 +593,7 @@
       </w:pPr>
       <w:r>
         <w:rPr/>
-        <w:t>Built reference and QNN evidence validators, generated-data aircraft design experiments, runtime contracts, and device-evidence capture workflows.</w:t>
+        <w:t>Built an ONNX/QNN deployment-evidence pipeline and evaluated flight anomalies on 17,780 aircraft-disjoint approaches. The model reached 94.96% accuracy but 0.7380 macro F1, so the release remains blocked instead of relying on accuracy alone.</w:t>
       </w:r>
     </w:p>
     <w:p>
@@ -645,7 +645,7 @@
       </w:pPr>
       <w:r>
         <w:rPr/>
-        <w:t>Built preference, calibration, transfer, downstream-utility, grouped-uncertainty, and human-alignment evaluation contracts. Synthetic and real-data claims are kept separate.</w:t>
+        <w:t>Built preference, calibration, transfer, downstream-utility, grouped-uncertainty, and human-alignment evaluation tooling. In a ten-seed AGDD study, mixed training improved macro F1 from 0.3881 to 0.4419 but reduced crack recall, so the release gate remains blocked.</w:t>
       </w:r>
     </w:p>
     <w:p>
@@ -679,7 +679,7 @@
       </w:pPr>
       <w:r>
         <w:rPr/>
-        <w:t>Built a point-in-time backtesting pipeline with membership validation, leakage checks, turnover, capacity constraints, and explicit boundaries around licensed CRSP data.</w:t>
+        <w:t>Built a monthly cross-sectional backtest with point-in-time membership validation, no-look-ahead controls, turnover, capacity constraints, and multiple-testing records. The pipeline explicitly withholds return claims pending licensed CRSP constituents and delisting returns.</w:t>
       </w:r>
     </w:p>
     <w:p>
@@ -713,7 +713,7 @@
       </w:pPr>
       <w:r>
         <w:rPr/>
-        <w:t>Built Gaussian-process and regression workflows for engineering data, repeated grouped robustness reports, uncertainty checks, and operating-domain warnings.</w:t>
+        <w:t>Built Gaussian-process and regression workflows for public engineering datasets with grouped holdouts, operating-domain warnings, uncertainty checks, and data-hashed repeated robustness reports. Airfoil robustness across ten grouped splits reached mean R² 0.8662.</w:t>
       </w:r>
     </w:p>
     <w:p>

</xml_diff>

<commit_message>
Standardize CV dates and alignment
</commit_message>
<xml_diff>
--- a/Triasha_Sarkar_CV.docx
+++ b/Triasha_Sarkar_CV.docx
@@ -322,7 +322,7 @@
       </w:pPr>
       <w:r>
         <w:rPr/>
-        <w:t>Project EAGLE — Vehicle Grand Challenge with RIC Enterprise, Georgia Tech2025 – 2026</w:t>
+        <w:t>Project EAGLE — Vehicle Grand Challenge with RIC Enterprise, Georgia TechSep 2025 – Present</w:t>
       </w:r>
     </w:p>
     <w:p>
@@ -348,7 +348,7 @@
       </w:pPr>
       <w:r>
         <w:rPr/>
-        <w:t>Project GREEN TEA — System of Systems Grand Challenge, Georgia Tech2025 – 2026</w:t>
+        <w:t>Project GREEN TEA — System of Systems Grand Challenge, Georgia TechSep 2025 – Present</w:t>
       </w:r>
     </w:p>
     <w:p>
@@ -991,7 +991,7 @@
       </w:pPr>
       <w:r>
         <w:rPr/>
-        <w:t>M.S., Aerospace Engineering — Georgia Institute of Technology2026</w:t>
+        <w:t>M.S., Aerospace Engineering — Georgia Institute of TechnologyAug 2026</w:t>
       </w:r>
     </w:p>
     <w:p>
@@ -1003,7 +1003,7 @@
       </w:pPr>
       <w:r>
         <w:rPr/>
-        <w:t>M.Sc., Aerospace Vehicle Design — Cranfield University2023</w:t>
+        <w:t>M.Sc., Aerospace Vehicle Design — Cranfield UniversityMar 2022 – Feb 2023</w:t>
       </w:r>
     </w:p>
     <w:p>
@@ -1015,7 +1015,7 @@
       </w:pPr>
       <w:r>
         <w:rPr/>
-        <w:t>B.Tech., Aerospace Engineering — SRM Institute of Science and Technology2021</w:t>
+        <w:t>B.Tech., Aerospace Engineering — SRM Institute of Science and TechnologyJul 2017 – Jun 2021</w:t>
       </w:r>
     </w:p>
     <w:sectPr>

</xml_diff>

<commit_message>
Sync engineering projects in CV
</commit_message>
<xml_diff>
--- a/Triasha_Sarkar_CV.docx
+++ b/Triasha_Sarkar_CV.docx
@@ -460,33 +460,12 @@
           <w:tab w:val="left" w:pos="709" w:leader="none"/>
         </w:tabs>
         <w:bidi w:val="0"/>
-        <w:spacing w:before="0" w:after="0"/>
         <w:ind w:hanging="283" w:start="709"/>
         <w:rPr/>
       </w:pPr>
       <w:r>
         <w:rPr/>
-        <w:t>Built a failure-detection workflow for 15,120 simulated rocket-motor time-series cases, reaching 96.8% accuracy and 0.986 ROC AUC on unseen geometries.</w:t>
-      </w:r>
-    </w:p>
-    <w:p>
-      <w:pPr>
-        <w:pStyle w:val="BodyText"/>
-        <w:numPr>
-          <w:ilvl w:val="0"/>
-          <w:numId w:val="2"/>
-        </w:numPr>
-        <w:tabs>
-          <w:tab w:val="clear" w:pos="1134"/>
-          <w:tab w:val="left" w:pos="709" w:leader="none"/>
-        </w:tabs>
-        <w:bidi w:val="0"/>
-        <w:ind w:hanging="283" w:start="709"/>
-        <w:rPr/>
-      </w:pPr>
-      <w:r>
-        <w:rPr/>
-        <w:t>Worked on Delta Air Lines-sponsored HERO retrieval and RAG methods for safety-related information; developed GREEN TEA surrogate models connecting lifecycle, economic, and transportation data.</w:t>
+        <w:t>Built a 15,120-case rocket-motor failure-detection workflow reaching 96.8% accuracy and 0.986 ROC AUC on unseen geometries; worked on HERO retrieval/RAG and GREEN TEA surrogate models.</w:t>
       </w:r>
     </w:p>
     <w:tbl>
@@ -560,33 +539,12 @@
           <w:tab w:val="left" w:pos="709" w:leader="none"/>
         </w:tabs>
         <w:bidi w:val="0"/>
-        <w:spacing w:before="0" w:after="0"/>
         <w:ind w:hanging="283" w:start="709"/>
         <w:rPr/>
       </w:pPr>
       <w:r>
         <w:rPr/>
-        <w:t>Built predictive-maintenance workflows for aircraft-engine sensor data, including Python pipelines for 1 Hz and 10 Hz multivariate time series, feature engineering, anomaly detection, and model evaluation.</w:t>
-      </w:r>
-    </w:p>
-    <w:p>
-      <w:pPr>
-        <w:pStyle w:val="BodyText"/>
-        <w:numPr>
-          <w:ilvl w:val="0"/>
-          <w:numId w:val="3"/>
-        </w:numPr>
-        <w:tabs>
-          <w:tab w:val="clear" w:pos="1134"/>
-          <w:tab w:val="left" w:pos="709" w:leader="none"/>
-        </w:tabs>
-        <w:bidi w:val="0"/>
-        <w:ind w:hanging="283" w:start="709"/>
-        <w:rPr/>
-      </w:pPr>
-      <w:r>
-        <w:rPr/>
-        <w:t>Worked with Lifecycle Engineers and domain experts on failure modes and repeatable Azure Databricks workflows for engineering datasets.</w:t>
+        <w:t>Built Python and Azure Databricks predictive-maintenance workflows for 1 Hz and 10 Hz aircraft-engine sensor data, including feature engineering, anomaly detection, model evaluation, and failure-mode review with domain experts.</w:t>
       </w:r>
     </w:p>
     <w:tbl>
@@ -767,33 +725,12 @@
           <w:tab w:val="left" w:pos="709" w:leader="none"/>
         </w:tabs>
         <w:bidi w:val="0"/>
-        <w:spacing w:before="0" w:after="0"/>
         <w:ind w:hanging="283" w:start="709"/>
         <w:rPr/>
       </w:pPr>
       <w:r>
         <w:rPr/>
-        <w:t>Independently extended the HERO retrieval work into a provenance-aware RAG evaluation system with BM25, dense retrieval, hybrid reranking, citation checks, safe agent degradation, and held-out QASPER/SciFact evaluation.</w:t>
-      </w:r>
-    </w:p>
-    <w:p>
-      <w:pPr>
-        <w:pStyle w:val="BodyText"/>
-        <w:numPr>
-          <w:ilvl w:val="0"/>
-          <w:numId w:val="5"/>
-        </w:numPr>
-        <w:tabs>
-          <w:tab w:val="clear" w:pos="1134"/>
-          <w:tab w:val="left" w:pos="709" w:leader="none"/>
-        </w:tabs>
-        <w:bidi w:val="0"/>
-        <w:ind w:hanging="283" w:start="709"/>
-        <w:rPr/>
-      </w:pPr>
-      <w:r>
-        <w:rPr/>
-        <w:t>Measured retrieval behavior from 10K to 1M NASA-text snapshots rather than assuming scale preserved ranking quality.</w:t>
+        <w:t>Independently extended HERO into a provenance-aware RAG evaluation system with BM25, dense retrieval, reranking, citation checks, safe agent degradation, held-out QASPER/SciFact evaluation, and 10K–1M NASA-text scale studies.</w:t>
       </w:r>
     </w:p>
     <w:tbl>
@@ -1007,6 +944,97 @@
         <w:t>Built an ONNX/QNN deployment-evidence pipeline and evaluated flight anomalies on 17,780 aircraft-disjoint approaches; 94.96% accuracy did not hide the 0.7380 macro-F1 release failure.</w:t>
       </w:r>
     </w:p>
+    <w:tbl>
+      <w:tblPr>
+        <w:tblW w:w="4791" w:type="dxa"/>
+        <w:jc w:val="start"/>
+        <w:tblInd w:w="0" w:type="dxa"/>
+        <w:tblLayout w:type="fixed"/>
+        <w:tblCellMar>
+          <w:top w:w="28" w:type="dxa"/>
+          <w:start w:w="28" w:type="dxa"/>
+          <w:bottom w:w="28" w:type="dxa"/>
+          <w:end w:w="28" w:type="dxa"/>
+        </w:tblCellMar>
+      </w:tblPr>
+      <w:tblGrid>
+        <w:gridCol w:w="3724"/>
+        <w:gridCol w:w="1067"/>
+      </w:tblGrid>
+      <w:tr>
+        <w:trPr/>
+        <w:tc>
+          <w:tcPr>
+            <w:tcW w:w="3724" w:type="dxa"/>
+            <w:tcBorders/>
+            <w:vAlign w:val="center"/>
+          </w:tcPr>
+          <w:p>
+            <w:pPr>
+              <w:pStyle w:val="TableContents"/>
+              <w:bidi w:val="0"/>
+              <w:spacing w:before="0" w:after="283"/>
+              <w:rPr/>
+            </w:pPr>
+            <w:r>
+              <w:rPr/>
+              <w:t>HERO | Source-Aware Retrieval for Airline Safety</w:t>
+            </w:r>
+          </w:p>
+        </w:tc>
+        <w:tc>
+          <w:tcPr>
+            <w:tcW w:w="1067" w:type="dxa"/>
+            <w:tcBorders/>
+            <w:vAlign w:val="center"/>
+          </w:tcPr>
+          <w:p>
+            <w:pPr>
+              <w:pStyle w:val="TableContents"/>
+              <w:bidi w:val="0"/>
+              <w:spacing w:before="0" w:after="283"/>
+              <w:rPr/>
+            </w:pPr>
+            <w:r>
+              <w:rPr/>
+              <w:t>2025 – 2026</w:t>
+            </w:r>
+          </w:p>
+        </w:tc>
+      </w:tr>
+    </w:tbl>
+    <w:p>
+      <w:pPr>
+        <w:pStyle w:val="BodyText"/>
+        <w:bidi w:val="0"/>
+        <w:spacing w:before="0" w:after="283"/>
+        <w:rPr/>
+      </w:pPr>
+      <w:r>
+        <w:rPr/>
+        <w:t>Georgia Tech ASDL · Graduate Research Assistant</w:t>
+      </w:r>
+    </w:p>
+    <w:p>
+      <w:pPr>
+        <w:pStyle w:val="BodyText"/>
+        <w:numPr>
+          <w:ilvl w:val="0"/>
+          <w:numId w:val="8"/>
+        </w:numPr>
+        <w:tabs>
+          <w:tab w:val="clear" w:pos="1134"/>
+          <w:tab w:val="left" w:pos="709" w:leader="none"/>
+        </w:tabs>
+        <w:bidi w:val="0"/>
+        <w:ind w:hanging="283" w:start="709"/>
+        <w:rPr/>
+      </w:pPr>
+      <w:r>
+        <w:rPr/>
+        <w:t>Explored retrieval and RAG methods for the Delta Air Lines-sponsored HERO project, helping analysts trace generated answers to safety-related technical sources.</w:t>
+      </w:r>
+    </w:p>
     <w:p>
       <w:pPr>
         <w:pStyle w:val="BodyText"/>
@@ -1040,7 +1068,7 @@
         <w:pStyle w:val="BodyText"/>
         <w:numPr>
           <w:ilvl w:val="0"/>
-          <w:numId w:val="8"/>
+          <w:numId w:val="9"/>
         </w:numPr>
         <w:tabs>
           <w:tab w:val="clear" w:pos="1134"/>
@@ -1088,40 +1116,19 @@
         <w:pStyle w:val="BodyText"/>
         <w:numPr>
           <w:ilvl w:val="0"/>
-          <w:numId w:val="9"/>
+          <w:numId w:val="10"/>
         </w:numPr>
         <w:tabs>
           <w:tab w:val="clear" w:pos="1134"/>
           <w:tab w:val="left" w:pos="709" w:leader="none"/>
         </w:tabs>
         <w:bidi w:val="0"/>
-        <w:spacing w:before="0" w:after="0"/>
         <w:ind w:hanging="283" w:start="709"/>
         <w:rPr/>
       </w:pPr>
       <w:r>
         <w:rPr/>
-        <w:t>Built preference, calibration, transfer, downstream-utility, grouped-uncertainty, and human-alignment evaluation tooling.</w:t>
-      </w:r>
-    </w:p>
-    <w:p>
-      <w:pPr>
-        <w:pStyle w:val="BodyText"/>
-        <w:numPr>
-          <w:ilvl w:val="0"/>
-          <w:numId w:val="9"/>
-        </w:numPr>
-        <w:tabs>
-          <w:tab w:val="clear" w:pos="1134"/>
-          <w:tab w:val="left" w:pos="709" w:leader="none"/>
-        </w:tabs>
-        <w:bidi w:val="0"/>
-        <w:ind w:hanging="283" w:start="709"/>
-        <w:rPr/>
-      </w:pPr>
-      <w:r>
-        <w:rPr/>
-        <w:t>In a ten-seed AGDD study, mixed training improved macro F1 from 0.3881 to 0.4419 but reduced crack recall, so the release gate remains blocked.</w:t>
+        <w:t>Built evaluation tooling for preference, calibration, transfer, utility, uncertainty, and alignment; a ten-seed AGDD study improved macro F1 from 0.3881 to 0.4419 but reduced crack recall, so the release stays blocked.</w:t>
       </w:r>
     </w:p>
     <w:p>
@@ -1157,7 +1164,7 @@
         <w:pStyle w:val="BodyText"/>
         <w:numPr>
           <w:ilvl w:val="0"/>
-          <w:numId w:val="10"/>
+          <w:numId w:val="11"/>
         </w:numPr>
         <w:tabs>
           <w:tab w:val="clear" w:pos="1134"/>
@@ -1205,7 +1212,7 @@
         <w:pStyle w:val="BodyText"/>
         <w:numPr>
           <w:ilvl w:val="0"/>
-          <w:numId w:val="11"/>
+          <w:numId w:val="12"/>
         </w:numPr>
         <w:tabs>
           <w:tab w:val="clear" w:pos="1134"/>
@@ -1253,7 +1260,7 @@
         <w:pStyle w:val="BodyText"/>
         <w:numPr>
           <w:ilvl w:val="0"/>
-          <w:numId w:val="12"/>
+          <w:numId w:val="13"/>
         </w:numPr>
         <w:tabs>
           <w:tab w:val="clear" w:pos="1134"/>
@@ -1278,50 +1285,6 @@
       <w:r>
         <w:rPr/>
         <w:t>Project EAGLE | Vehicle Grand Challenge with RIC EnterpriseSep 2025 – Present</w:t>
-      </w:r>
-    </w:p>
-    <w:p>
-      <w:pPr>
-        <w:pStyle w:val="BodyText"/>
-        <w:bidi w:val="0"/>
-        <w:spacing w:before="0" w:after="283"/>
-        <w:rPr/>
-      </w:pPr>
-      <w:r>
-        <w:rPr/>
-        <w:t>Georgia Tech ASDL · Graduate Research Assistant</w:t>
-      </w:r>
-    </w:p>
-    <w:p>
-      <w:pPr>
-        <w:pStyle w:val="BodyText"/>
-        <w:numPr>
-          <w:ilvl w:val="0"/>
-          <w:numId w:val="13"/>
-        </w:numPr>
-        <w:tabs>
-          <w:tab w:val="clear" w:pos="1134"/>
-          <w:tab w:val="left" w:pos="709" w:leader="none"/>
-        </w:tabs>
-        <w:bidi w:val="0"/>
-        <w:ind w:hanging="283" w:start="709"/>
-        <w:rPr/>
-      </w:pPr>
-      <w:r>
-        <w:rPr/>
-        <w:t>Developed a sizing and synthesis tool for the Eco-friendly Airborne Global Luxury Ekranoplan, including passenger layout, cabin geometry in AutoCAD, and vehicle requirements.</w:t>
-      </w:r>
-    </w:p>
-    <w:p>
-      <w:pPr>
-        <w:pStyle w:val="BodyText"/>
-        <w:bidi w:val="0"/>
-        <w:spacing w:before="0" w:after="0"/>
-        <w:rPr/>
-      </w:pPr>
-      <w:r>
-        <w:rPr/>
-        <w:t>Project GREEN TEA | Sustainable Aviation ModelingSep 2025 – Present</w:t>
       </w:r>
     </w:p>
     <w:p>
@@ -1342,6 +1305,50 @@
         <w:numPr>
           <w:ilvl w:val="0"/>
           <w:numId w:val="14"/>
+        </w:numPr>
+        <w:tabs>
+          <w:tab w:val="clear" w:pos="1134"/>
+          <w:tab w:val="left" w:pos="709" w:leader="none"/>
+        </w:tabs>
+        <w:bidi w:val="0"/>
+        <w:ind w:hanging="283" w:start="709"/>
+        <w:rPr/>
+      </w:pPr>
+      <w:r>
+        <w:rPr/>
+        <w:t>Developed sizing/synthesis tooling, passenger layout, AutoCAD cabin geometry, and requirements for the Eco-friendly Airborne Global Luxury Ekranoplan.</w:t>
+      </w:r>
+    </w:p>
+    <w:p>
+      <w:pPr>
+        <w:pStyle w:val="BodyText"/>
+        <w:bidi w:val="0"/>
+        <w:spacing w:before="0" w:after="0"/>
+        <w:rPr/>
+      </w:pPr>
+      <w:r>
+        <w:rPr/>
+        <w:t>Project GREEN TEA | Sustainable Aviation ModelingSep 2025 – Present</w:t>
+      </w:r>
+    </w:p>
+    <w:p>
+      <w:pPr>
+        <w:pStyle w:val="BodyText"/>
+        <w:bidi w:val="0"/>
+        <w:spacing w:before="0" w:after="283"/>
+        <w:rPr/>
+      </w:pPr>
+      <w:r>
+        <w:rPr/>
+        <w:t>Georgia Tech ASDL · Graduate Research Assistant</w:t>
+      </w:r>
+    </w:p>
+    <w:p>
+      <w:pPr>
+        <w:pStyle w:val="BodyText"/>
+        <w:numPr>
+          <w:ilvl w:val="0"/>
+          <w:numId w:val="15"/>
         </w:numPr>
         <w:tabs>
           <w:tab w:val="clear" w:pos="1134"/>
@@ -3219,6 +3226,143 @@
     </w:lvl>
   </w:abstractNum>
   <w:abstractNum w:abstractNumId="14">
+    <w:lvl w:ilvl="0">
+      <w:start w:val="1"/>
+      <w:numFmt w:val="bullet"/>
+      <w:lvlText w:val=""/>
+      <w:lvlJc w:val="start"/>
+      <w:pPr>
+        <w:tabs>
+          <w:tab w:val="num" w:pos="709"/>
+        </w:tabs>
+        <w:ind w:start="709" w:hanging="283"/>
+      </w:pPr>
+      <w:rPr>
+        <w:rFonts w:ascii="Symbol" w:hAnsi="Symbol" w:cs="Symbol" w:hint="default"/>
+      </w:rPr>
+    </w:lvl>
+    <w:lvl w:ilvl="1">
+      <w:start w:val="1"/>
+      <w:numFmt w:val="bullet"/>
+      <w:lvlText w:val=""/>
+      <w:lvlJc w:val="start"/>
+      <w:pPr>
+        <w:tabs>
+          <w:tab w:val="num" w:pos="1418"/>
+        </w:tabs>
+        <w:ind w:start="1418" w:hanging="283"/>
+      </w:pPr>
+      <w:rPr>
+        <w:rFonts w:ascii="Symbol" w:hAnsi="Symbol" w:cs="Symbol" w:hint="default"/>
+      </w:rPr>
+    </w:lvl>
+    <w:lvl w:ilvl="2">
+      <w:start w:val="1"/>
+      <w:numFmt w:val="bullet"/>
+      <w:lvlText w:val=""/>
+      <w:lvlJc w:val="start"/>
+      <w:pPr>
+        <w:tabs>
+          <w:tab w:val="num" w:pos="2127"/>
+        </w:tabs>
+        <w:ind w:start="2127" w:hanging="283"/>
+      </w:pPr>
+      <w:rPr>
+        <w:rFonts w:ascii="Symbol" w:hAnsi="Symbol" w:cs="Symbol" w:hint="default"/>
+      </w:rPr>
+    </w:lvl>
+    <w:lvl w:ilvl="3">
+      <w:start w:val="1"/>
+      <w:numFmt w:val="bullet"/>
+      <w:lvlText w:val=""/>
+      <w:lvlJc w:val="start"/>
+      <w:pPr>
+        <w:tabs>
+          <w:tab w:val="num" w:pos="2836"/>
+        </w:tabs>
+        <w:ind w:start="2836" w:hanging="283"/>
+      </w:pPr>
+      <w:rPr>
+        <w:rFonts w:ascii="Symbol" w:hAnsi="Symbol" w:cs="Symbol" w:hint="default"/>
+      </w:rPr>
+    </w:lvl>
+    <w:lvl w:ilvl="4">
+      <w:start w:val="1"/>
+      <w:numFmt w:val="bullet"/>
+      <w:lvlText w:val=""/>
+      <w:lvlJc w:val="start"/>
+      <w:pPr>
+        <w:tabs>
+          <w:tab w:val="num" w:pos="3545"/>
+        </w:tabs>
+        <w:ind w:start="3545" w:hanging="283"/>
+      </w:pPr>
+      <w:rPr>
+        <w:rFonts w:ascii="Symbol" w:hAnsi="Symbol" w:cs="Symbol" w:hint="default"/>
+      </w:rPr>
+    </w:lvl>
+    <w:lvl w:ilvl="5">
+      <w:start w:val="1"/>
+      <w:numFmt w:val="bullet"/>
+      <w:lvlText w:val=""/>
+      <w:lvlJc w:val="start"/>
+      <w:pPr>
+        <w:tabs>
+          <w:tab w:val="num" w:pos="4254"/>
+        </w:tabs>
+        <w:ind w:start="4254" w:hanging="283"/>
+      </w:pPr>
+      <w:rPr>
+        <w:rFonts w:ascii="Symbol" w:hAnsi="Symbol" w:cs="Symbol" w:hint="default"/>
+      </w:rPr>
+    </w:lvl>
+    <w:lvl w:ilvl="6">
+      <w:start w:val="1"/>
+      <w:numFmt w:val="bullet"/>
+      <w:lvlText w:val=""/>
+      <w:lvlJc w:val="start"/>
+      <w:pPr>
+        <w:tabs>
+          <w:tab w:val="num" w:pos="4963"/>
+        </w:tabs>
+        <w:ind w:start="4963" w:hanging="283"/>
+      </w:pPr>
+      <w:rPr>
+        <w:rFonts w:ascii="Symbol" w:hAnsi="Symbol" w:cs="Symbol" w:hint="default"/>
+      </w:rPr>
+    </w:lvl>
+    <w:lvl w:ilvl="7">
+      <w:start w:val="1"/>
+      <w:numFmt w:val="bullet"/>
+      <w:lvlText w:val=""/>
+      <w:lvlJc w:val="start"/>
+      <w:pPr>
+        <w:tabs>
+          <w:tab w:val="num" w:pos="5672"/>
+        </w:tabs>
+        <w:ind w:start="5672" w:hanging="283"/>
+      </w:pPr>
+      <w:rPr>
+        <w:rFonts w:ascii="Symbol" w:hAnsi="Symbol" w:cs="Symbol" w:hint="default"/>
+      </w:rPr>
+    </w:lvl>
+    <w:lvl w:ilvl="8">
+      <w:start w:val="1"/>
+      <w:numFmt w:val="bullet"/>
+      <w:lvlText w:val=""/>
+      <w:lvlJc w:val="start"/>
+      <w:pPr>
+        <w:tabs>
+          <w:tab w:val="num" w:pos="6381"/>
+        </w:tabs>
+        <w:ind w:start="6381" w:hanging="283"/>
+      </w:pPr>
+      <w:rPr>
+        <w:rFonts w:ascii="Symbol" w:hAnsi="Symbol" w:cs="Symbol" w:hint="default"/>
+      </w:rPr>
+    </w:lvl>
+  </w:abstractNum>
+  <w:abstractNum w:abstractNumId="15">
     <w:lvl w:ilvl="0">
       <w:start w:val="1"/>
       <w:numFmt w:val="bullet"/>
@@ -3396,6 +3540,9 @@
   </w:num>
   <w:num w:numId="14">
     <w:abstractNumId w:val="14"/>
+  </w:num>
+  <w:num w:numId="15">
+    <w:abstractNumId w:val="15"/>
   </w:num>
 </w:numbering>
 </file>

</xml_diff>

<commit_message>
Update project end dates, Atlanta repository links, and hackathon formatting
</commit_message>
<xml_diff>
--- a/Triasha_Sarkar_CV.docx
+++ b/Triasha_Sarkar_CV.docx
@@ -1188,7 +1188,7 @@
       </w:pPr>
       <w:r>
         <w:rPr/>
-        <w:t>Surrogate Model Learning | Robust Regression2025 – Present</w:t>
+        <w:t>Surrogate Model Learning | Robust Regression2025 – Oct 2026</w:t>
       </w:r>
     </w:p>
     <w:p>
@@ -1236,7 +1236,7 @@
       </w:pPr>
       <w:r>
         <w:rPr/>
-        <w:t>Equity Backtest | Walk-Forward Signal EvaluationJul 2026</w:t>
+        <w:t>Equity Backtest | Walk-Forward Signal EvaluationJul 2026 – Sep 2026</w:t>
       </w:r>
     </w:p>
     <w:p>
@@ -1284,7 +1284,7 @@
       </w:pPr>
       <w:r>
         <w:rPr/>
-        <w:t>Project EAGLE | Vehicle Grand Challenge with RIC EnterpriseSep 2025 – Present</w:t>
+        <w:t>Project EAGLE | Vehicle Grand Challenge with RIC EnterpriseSep 2025 – May 2026</w:t>
       </w:r>
     </w:p>
     <w:p>

</xml_diff>